<commit_message>
Add Week 3 work
</commit_message>
<xml_diff>
--- a/Week_3/Week_3.docx
+++ b/Week_3/Week_3.docx
@@ -62,19 +62,7 @@
         <w:jc w:val="both"/>
       </w:pPr>
       <w:r>
-        <w:t xml:space="preserve">Clustering is an unsupervised machine learning technique </w:t>
-      </w:r>
-      <w:r>
-        <w:t xml:space="preserve">that groups data points so </w:t>
-      </w:r>
-      <w:r>
-        <w:t xml:space="preserve">objects within the same group (called a cluster) are more similar to each other than to objects in other groups. Unlike supervised learning, clustering does not use labeled data the algorithm discovers structure in the data on its own. It is widely used in customer segmentation, image analysis, document classification, anomaly detection, and biological data analysis (e.g., </w:t>
-      </w:r>
-      <w:r>
-        <w:t>grouping gene expression</w:t>
-      </w:r>
-      <w:r>
-        <w:t>).</w:t>
+        <w:t>Clustering is an unsupervised machine learning technique that groups data points so objects within the same group (called a cluster) are more similar to each other than to objects in other groups. Unlike supervised learning, clustering does not use labeled data the algorithm discovers structure in the data on its own. It is widely used in customer segmentation, image analysis, document classification, anomaly detection, and biological data analysis (e.g., grouping gene expression).</w:t>
       </w:r>
     </w:p>
     <w:p>
@@ -657,13 +645,7 @@
         <w:jc w:val="both"/>
       </w:pPr>
       <w:r>
-        <w:t>A dendrogram visually represents the merging process. The height at which two clusters are joined reflects the distance between them</w:t>
-      </w:r>
-      <w:r>
-        <w:t xml:space="preserve"> </w:t>
-      </w:r>
-      <w:r>
-        <w:t xml:space="preserve">the greater the height, the less similar the clusters. Cutting the dendrogram </w:t>
+        <w:t xml:space="preserve">A dendrogram visually represents the merging process. The height at which two clusters are joined reflects the distance between them the greater the height, the less similar the clusters. Cutting the dendrogram </w:t>
       </w:r>
       <w:r>
         <w:lastRenderedPageBreak/>
@@ -906,12 +888,6 @@
         <w:gridCol w:w="3659"/>
       </w:tblGrid>
       <w:tr>
-        <w:tblPrEx>
-          <w:tblCellMar>
-            <w:top w:w="0" w:type="dxa"/>
-            <w:bottom w:w="0" w:type="dxa"/>
-          </w:tblCellMar>
-        </w:tblPrEx>
         <w:trPr>
           <w:trHeight w:val="281"/>
           <w:tblHeader/>
@@ -999,12 +975,6 @@
         </w:tc>
       </w:tr>
       <w:tr>
-        <w:tblPrEx>
-          <w:tblCellMar>
-            <w:top w:w="0" w:type="dxa"/>
-            <w:bottom w:w="0" w:type="dxa"/>
-          </w:tblCellMar>
-        </w:tblPrEx>
         <w:trPr>
           <w:trHeight w:val="281"/>
         </w:trPr>
@@ -1059,12 +1029,6 @@
         </w:tc>
       </w:tr>
       <w:tr>
-        <w:tblPrEx>
-          <w:tblCellMar>
-            <w:top w:w="0" w:type="dxa"/>
-            <w:bottom w:w="0" w:type="dxa"/>
-          </w:tblCellMar>
-        </w:tblPrEx>
         <w:trPr>
           <w:trHeight w:val="563"/>
         </w:trPr>
@@ -1119,12 +1083,6 @@
         </w:tc>
       </w:tr>
       <w:tr>
-        <w:tblPrEx>
-          <w:tblCellMar>
-            <w:top w:w="0" w:type="dxa"/>
-            <w:bottom w:w="0" w:type="dxa"/>
-          </w:tblCellMar>
-        </w:tblPrEx>
         <w:trPr>
           <w:trHeight w:val="281"/>
         </w:trPr>
@@ -1179,12 +1137,6 @@
         </w:tc>
       </w:tr>
       <w:tr>
-        <w:tblPrEx>
-          <w:tblCellMar>
-            <w:top w:w="0" w:type="dxa"/>
-            <w:bottom w:w="0" w:type="dxa"/>
-          </w:tblCellMar>
-        </w:tblPrEx>
         <w:trPr>
           <w:trHeight w:val="265"/>
         </w:trPr>
@@ -1239,12 +1191,6 @@
         </w:tc>
       </w:tr>
       <w:tr>
-        <w:tblPrEx>
-          <w:tblCellMar>
-            <w:top w:w="0" w:type="dxa"/>
-            <w:bottom w:w="0" w:type="dxa"/>
-          </w:tblCellMar>
-        </w:tblPrEx>
         <w:trPr>
           <w:trHeight w:val="563"/>
         </w:trPr>
@@ -1299,12 +1245,6 @@
         </w:tc>
       </w:tr>
       <w:tr>
-        <w:tblPrEx>
-          <w:tblCellMar>
-            <w:top w:w="0" w:type="dxa"/>
-            <w:bottom w:w="0" w:type="dxa"/>
-          </w:tblCellMar>
-        </w:tblPrEx>
         <w:trPr>
           <w:trHeight w:val="563"/>
         </w:trPr>
@@ -1359,12 +1299,6 @@
         </w:tc>
       </w:tr>
       <w:tr>
-        <w:tblPrEx>
-          <w:tblCellMar>
-            <w:top w:w="0" w:type="dxa"/>
-            <w:bottom w:w="0" w:type="dxa"/>
-          </w:tblCellMar>
-        </w:tblPrEx>
         <w:trPr>
           <w:trHeight w:val="579"/>
         </w:trPr>
@@ -1423,6 +1357,407 @@
       <w:pPr>
         <w:spacing w:after="160" w:line="300" w:lineRule="auto"/>
       </w:pPr>
+    </w:p>
+    <w:p>
+      <w:pPr>
+        <w:pStyle w:val="Heading1"/>
+        <w:spacing w:before="320" w:after="160"/>
+      </w:pPr>
+      <w:r>
+        <w:rPr>
+          <w:b/>
+          <w:bCs/>
+          <w:color w:val="1F4E79"/>
+        </w:rPr>
+        <w:lastRenderedPageBreak/>
+        <w:t>5. Principal Component Analysis (PCA)</w:t>
+      </w:r>
+    </w:p>
+    <w:p>
+      <w:pPr>
+        <w:spacing w:after="160" w:line="300" w:lineRule="auto"/>
+        <w:jc w:val="both"/>
+      </w:pPr>
+      <w:r>
+        <w:t>Principal Component Analysis (PCA) is an unsupervised dimensionality-reduction technique that transforms a dataset with many correlated variables into a smaller set of uncorrelated variables called principal components, while preserving as much of the original variance as possible. It is widely used both to visualize high-dimensional data in two or three dimensions and to reduce the number of features before applying other machine learning algorithms.</w:t>
+      </w:r>
+    </w:p>
+    <w:p>
+      <w:pPr>
+        <w:pStyle w:val="Heading2"/>
+        <w:spacing w:before="240" w:after="120"/>
+      </w:pPr>
+      <w:r>
+        <w:rPr>
+          <w:b/>
+          <w:bCs/>
+          <w:color w:val="2E75B6"/>
+        </w:rPr>
+        <w:t>5.1 Definition</w:t>
+      </w:r>
+    </w:p>
+    <w:p>
+      <w:pPr>
+        <w:spacing w:after="160" w:line="300" w:lineRule="auto"/>
+        <w:jc w:val="both"/>
+      </w:pPr>
+      <w:r>
+        <w:t>PCA works by finding new axes, principal components, that are linear combinations of the original features. The first principal component captures the direction of maximum variance in the data, the second component captures the next largest variance while being orthogonal (uncorrelated) to the first, and so on. Projecting the data onto a small number of these components reduces dimensionality while retaining most of the information.</w:t>
+      </w:r>
+    </w:p>
+    <w:p>
+      <w:pPr>
+        <w:pStyle w:val="Heading2"/>
+        <w:spacing w:before="240" w:after="120"/>
+      </w:pPr>
+      <w:r>
+        <w:rPr>
+          <w:b/>
+          <w:bCs/>
+          <w:color w:val="2E75B6"/>
+        </w:rPr>
+        <w:t>5.2 Algorithm Steps</w:t>
+      </w:r>
+    </w:p>
+    <w:p>
+      <w:pPr>
+        <w:pStyle w:val="ListParagraph"/>
+        <w:numPr>
+          <w:ilvl w:val="0"/>
+          <w:numId w:val="2"/>
+        </w:numPr>
+        <w:spacing w:after="80"/>
+        <w:jc w:val="both"/>
+      </w:pPr>
+      <w:r>
+        <w:rPr>
+          <w:b/>
+          <w:bCs/>
+        </w:rPr>
+        <w:t xml:space="preserve">Step 1 – Standardization: </w:t>
+      </w:r>
+      <w:r>
+        <w:t>Standardize the dataset so that all features have zero mean and unit variance, since PCA is sensitive to the scale of variables.</w:t>
+      </w:r>
+    </w:p>
+    <w:p>
+      <w:pPr>
+        <w:pStyle w:val="ListParagraph"/>
+        <w:numPr>
+          <w:ilvl w:val="0"/>
+          <w:numId w:val="2"/>
+        </w:numPr>
+        <w:spacing w:after="80"/>
+        <w:jc w:val="both"/>
+      </w:pPr>
+      <w:r>
+        <w:rPr>
+          <w:b/>
+          <w:bCs/>
+        </w:rPr>
+        <w:t xml:space="preserve">Step 2 – Covariance Matrix: </w:t>
+      </w:r>
+      <w:r>
+        <w:t>Compute the covariance matrix of the standardized features to understand how variables vary together.</w:t>
+      </w:r>
+    </w:p>
+    <w:p>
+      <w:pPr>
+        <w:pStyle w:val="ListParagraph"/>
+        <w:numPr>
+          <w:ilvl w:val="0"/>
+          <w:numId w:val="2"/>
+        </w:numPr>
+        <w:spacing w:after="80"/>
+        <w:jc w:val="both"/>
+      </w:pPr>
+      <w:r>
+        <w:rPr>
+          <w:b/>
+          <w:bCs/>
+        </w:rPr>
+        <w:t xml:space="preserve">Step 3 – Eigen Decomposition: </w:t>
+      </w:r>
+      <w:r>
+        <w:t>Calculate the eigenvectors and eigenvalues of the covariance matrix; eigenvectors define the principal component directions and eigenvalues indicate the amount of variance explained by each.</w:t>
+      </w:r>
+    </w:p>
+    <w:p>
+      <w:pPr>
+        <w:pStyle w:val="ListParagraph"/>
+        <w:numPr>
+          <w:ilvl w:val="0"/>
+          <w:numId w:val="2"/>
+        </w:numPr>
+        <w:spacing w:after="80"/>
+        <w:jc w:val="both"/>
+      </w:pPr>
+      <w:r>
+        <w:rPr>
+          <w:b/>
+          <w:bCs/>
+        </w:rPr>
+        <w:t xml:space="preserve">Step 4 – Select Components: </w:t>
+      </w:r>
+      <w:r>
+        <w:t>Sort eigenvectors by their eigenvalues in descending order and select the top k eigenvectors to form the new feature space.</w:t>
+      </w:r>
+    </w:p>
+    <w:p>
+      <w:pPr>
+        <w:pStyle w:val="ListParagraph"/>
+        <w:numPr>
+          <w:ilvl w:val="0"/>
+          <w:numId w:val="2"/>
+        </w:numPr>
+        <w:spacing w:after="80"/>
+        <w:jc w:val="both"/>
+      </w:pPr>
+      <w:r>
+        <w:rPr>
+          <w:b/>
+          <w:bCs/>
+        </w:rPr>
+        <w:t xml:space="preserve">Step 5 – Project Data: </w:t>
+      </w:r>
+      <w:r>
+        <w:t>Transform the original dataset by projecting it onto the selected principal components, producing a lower-dimensional representation.</w:t>
+      </w:r>
+    </w:p>
+    <w:p>
+      <w:pPr>
+        <w:pStyle w:val="Heading2"/>
+        <w:spacing w:before="240" w:after="120"/>
+      </w:pPr>
+      <w:r>
+        <w:rPr>
+          <w:b/>
+          <w:bCs/>
+          <w:color w:val="2E75B6"/>
+        </w:rPr>
+        <w:t>5.3 Choosing the Number of Components</w:t>
+      </w:r>
+    </w:p>
+    <w:p>
+      <w:pPr>
+        <w:spacing w:after="160" w:line="300" w:lineRule="auto"/>
+        <w:jc w:val="both"/>
+      </w:pPr>
+      <w:r>
+        <w:t>The number of principal components to keep is usually chosen using a scree plot, which shows the variance explained by each component, or by selecting enough components to retain a target cumulative explained variance (commonly 90–95%). For visualization purposes, the first two or three components are typically used so the data can be plotted directly.</w:t>
+      </w:r>
+    </w:p>
+    <w:p>
+      <w:pPr>
+        <w:pStyle w:val="Heading2"/>
+        <w:spacing w:before="240" w:after="120"/>
+      </w:pPr>
+      <w:r>
+        <w:rPr>
+          <w:b/>
+          <w:bCs/>
+          <w:color w:val="2E75B6"/>
+        </w:rPr>
+        <w:t>5.4 Advantages</w:t>
+      </w:r>
+    </w:p>
+    <w:p>
+      <w:pPr>
+        <w:pStyle w:val="ListParagraph"/>
+        <w:numPr>
+          <w:ilvl w:val="0"/>
+          <w:numId w:val="2"/>
+        </w:numPr>
+        <w:spacing w:after="80"/>
+        <w:jc w:val="both"/>
+      </w:pPr>
+      <w:r>
+        <w:t>Reduces the number of features while retaining most of the important information in the data.</w:t>
+      </w:r>
+    </w:p>
+    <w:p>
+      <w:pPr>
+        <w:pStyle w:val="ListParagraph"/>
+        <w:numPr>
+          <w:ilvl w:val="0"/>
+          <w:numId w:val="2"/>
+        </w:numPr>
+        <w:spacing w:after="80"/>
+        <w:jc w:val="both"/>
+      </w:pPr>
+      <w:r>
+        <w:t>Removes multicollinearity by producing uncorrelated components.</w:t>
+      </w:r>
+    </w:p>
+    <w:p>
+      <w:pPr>
+        <w:pStyle w:val="ListParagraph"/>
+        <w:numPr>
+          <w:ilvl w:val="0"/>
+          <w:numId w:val="2"/>
+        </w:numPr>
+        <w:spacing w:after="80"/>
+        <w:jc w:val="both"/>
+      </w:pPr>
+      <w:r>
+        <w:t>Enables visualization of high-dimensional data in two or three dimensions.</w:t>
+      </w:r>
+    </w:p>
+    <w:p>
+      <w:pPr>
+        <w:pStyle w:val="ListParagraph"/>
+        <w:numPr>
+          <w:ilvl w:val="0"/>
+          <w:numId w:val="2"/>
+        </w:numPr>
+        <w:spacing w:after="80"/>
+        <w:jc w:val="both"/>
+      </w:pPr>
+      <w:r>
+        <w:t>Can improve the speed and performance of downstream machine learning models by reducing noise and redundancy.</w:t>
+      </w:r>
+    </w:p>
+    <w:p>
+      <w:pPr>
+        <w:pStyle w:val="Heading2"/>
+        <w:spacing w:before="240" w:after="120"/>
+      </w:pPr>
+      <w:r>
+        <w:rPr>
+          <w:b/>
+          <w:bCs/>
+          <w:color w:val="2E75B6"/>
+        </w:rPr>
+        <w:t>5.5 Disadvantages</w:t>
+      </w:r>
+    </w:p>
+    <w:p>
+      <w:pPr>
+        <w:pStyle w:val="ListParagraph"/>
+        <w:numPr>
+          <w:ilvl w:val="0"/>
+          <w:numId w:val="2"/>
+        </w:numPr>
+        <w:spacing w:after="80"/>
+        <w:jc w:val="both"/>
+      </w:pPr>
+      <w:r>
+        <w:lastRenderedPageBreak/>
+        <w:t>Principal components are linear combinations of original features, which makes them harder to interpret.</w:t>
+      </w:r>
+    </w:p>
+    <w:p>
+      <w:pPr>
+        <w:pStyle w:val="ListParagraph"/>
+        <w:numPr>
+          <w:ilvl w:val="0"/>
+          <w:numId w:val="2"/>
+        </w:numPr>
+        <w:spacing w:after="80"/>
+        <w:jc w:val="both"/>
+      </w:pPr>
+      <w:r>
+        <w:t>Sensitive to the scale of the data, so features must be standardized beforehand.</w:t>
+      </w:r>
+    </w:p>
+    <w:p>
+      <w:pPr>
+        <w:pStyle w:val="ListParagraph"/>
+        <w:numPr>
+          <w:ilvl w:val="0"/>
+          <w:numId w:val="2"/>
+        </w:numPr>
+        <w:spacing w:after="80"/>
+        <w:jc w:val="both"/>
+      </w:pPr>
+      <w:r>
+        <w:t>Assumes linear relationships between variables and may not capture complex, non-linear structure.</w:t>
+      </w:r>
+    </w:p>
+    <w:p>
+      <w:pPr>
+        <w:pStyle w:val="ListParagraph"/>
+        <w:numPr>
+          <w:ilvl w:val="0"/>
+          <w:numId w:val="2"/>
+        </w:numPr>
+        <w:spacing w:after="80"/>
+        <w:jc w:val="both"/>
+      </w:pPr>
+      <w:r>
+        <w:t>Some information is inevitably lost when reducing dimensions.</w:t>
+      </w:r>
+    </w:p>
+    <w:p>
+      <w:pPr>
+        <w:pStyle w:val="Heading2"/>
+        <w:spacing w:before="240" w:after="120"/>
+        <w:jc w:val="both"/>
+      </w:pPr>
+      <w:r>
+        <w:rPr>
+          <w:b/>
+          <w:bCs/>
+          <w:color w:val="2E75B6"/>
+        </w:rPr>
+        <w:t>5.6 Applications</w:t>
+      </w:r>
+    </w:p>
+    <w:p>
+      <w:pPr>
+        <w:pStyle w:val="ListParagraph"/>
+        <w:numPr>
+          <w:ilvl w:val="0"/>
+          <w:numId w:val="2"/>
+        </w:numPr>
+        <w:spacing w:after="80"/>
+        <w:jc w:val="both"/>
+      </w:pPr>
+      <w:r>
+        <w:t>Visualizing high-dimensional datasets, such as gene expression or image data, in two or three dimensions.</w:t>
+      </w:r>
+    </w:p>
+    <w:p>
+      <w:pPr>
+        <w:pStyle w:val="ListParagraph"/>
+        <w:numPr>
+          <w:ilvl w:val="0"/>
+          <w:numId w:val="2"/>
+        </w:numPr>
+        <w:spacing w:after="80"/>
+        <w:jc w:val="both"/>
+      </w:pPr>
+      <w:r>
+        <w:t>Reducing features before clustering or classification to speed up training and reduce overfitting.</w:t>
+      </w:r>
+    </w:p>
+    <w:p>
+      <w:pPr>
+        <w:pStyle w:val="ListParagraph"/>
+        <w:numPr>
+          <w:ilvl w:val="0"/>
+          <w:numId w:val="2"/>
+        </w:numPr>
+        <w:spacing w:after="80"/>
+        <w:jc w:val="both"/>
+      </w:pPr>
+      <w:r>
+        <w:t>Noise reduction and data compression in image processing.</w:t>
+      </w:r>
+    </w:p>
+    <w:p>
+      <w:pPr>
+        <w:pStyle w:val="ListParagraph"/>
+        <w:numPr>
+          <w:ilvl w:val="0"/>
+          <w:numId w:val="2"/>
+        </w:numPr>
+        <w:spacing w:after="80"/>
+        <w:jc w:val="both"/>
+      </w:pPr>
+      <w:r>
+        <w:t>Exploratory data analysis to identify patterns, outliers, and relationships among variables.</w:t>
+      </w:r>
     </w:p>
     <w:sectPr>
       <w:pgSz w:w="12240" w:h="15840"/>

</xml_diff>

<commit_message>
Update Week 3 documentation
</commit_message>
<xml_diff>
--- a/Week_3/Week_3.docx
+++ b/Week_3/Week_3.docx
@@ -6,8 +6,6 @@
       <w:pPr>
         <w:spacing w:after="40"/>
         <w:jc w:val="center"/>
-      </w:pPr>
-      <w:r>
         <w:rPr>
           <w:b/>
           <w:bCs/>
@@ -15,23 +13,32 @@
           <w:sz w:val="40"/>
           <w:szCs w:val="40"/>
         </w:rPr>
-        <w:t>K-Means and Hierarchical Clustering</w:t>
-      </w:r>
-    </w:p>
-    <w:p>
-      <w:pPr>
-        <w:spacing w:after="300"/>
+      </w:pPr>
+      <w:r>
+        <w:rPr>
+          <w:b/>
+          <w:bCs/>
+          <w:color w:val="1F4E79"/>
+          <w:sz w:val="40"/>
+          <w:szCs w:val="40"/>
+        </w:rPr>
+        <w:t xml:space="preserve">Week 3: </w:t>
+      </w:r>
+    </w:p>
+    <w:p>
+      <w:pPr>
+        <w:spacing w:after="40"/>
         <w:jc w:val="center"/>
       </w:pPr>
       <w:r>
         <w:rPr>
-          <w:i/>
-          <w:iCs/>
-          <w:color w:val="555555"/>
-          <w:sz w:val="24"/>
-          <w:szCs w:val="24"/>
-        </w:rPr>
-        <w:t>Unsupervised Learning Algorithms</w:t>
+          <w:b/>
+          <w:bCs/>
+          <w:color w:val="1F4E79"/>
+          <w:sz w:val="40"/>
+          <w:szCs w:val="40"/>
+        </w:rPr>
+        <w:t>Unsupervised Learning &amp; Hyperparameter Tuning</w:t>
       </w:r>
     </w:p>
     <w:p>
@@ -76,6 +83,90 @@
     </w:p>
     <w:p>
       <w:pPr>
+        <w:spacing w:after="160" w:line="300" w:lineRule="auto"/>
+        <w:jc w:val="both"/>
+      </w:pPr>
+    </w:p>
+    <w:p>
+      <w:pPr>
+        <w:spacing w:after="160" w:line="300" w:lineRule="auto"/>
+        <w:jc w:val="center"/>
+      </w:pPr>
+    </w:p>
+    <w:p>
+      <w:pPr>
+        <w:spacing w:after="160" w:line="300" w:lineRule="auto"/>
+        <w:jc w:val="center"/>
+      </w:pPr>
+    </w:p>
+    <w:p>
+      <w:pPr>
+        <w:spacing w:after="160" w:line="300" w:lineRule="auto"/>
+        <w:jc w:val="center"/>
+      </w:pPr>
+      <w:r>
+        <w:rPr>
+          <w:noProof/>
+        </w:rPr>
+        <w:drawing>
+          <wp:inline distT="0" distB="0" distL="0" distR="0" wp14:anchorId="6EC85E22" wp14:editId="3B367713">
+            <wp:extent cx="6038850" cy="3508375"/>
+            <wp:effectExtent l="76200" t="76200" r="133350" b="130175"/>
+            <wp:docPr id="1802381698" name="Picture 1"/>
+            <wp:cNvGraphicFramePr>
+              <a:graphicFrameLocks xmlns:a="http://schemas.openxmlformats.org/drawingml/2006/main" noChangeAspect="1"/>
+            </wp:cNvGraphicFramePr>
+            <a:graphic xmlns:a="http://schemas.openxmlformats.org/drawingml/2006/main">
+              <a:graphicData uri="http://schemas.openxmlformats.org/drawingml/2006/picture">
+                <pic:pic xmlns:pic="http://schemas.openxmlformats.org/drawingml/2006/picture">
+                  <pic:nvPicPr>
+                    <pic:cNvPr id="1802381698" name="Picture 1802381698"/>
+                    <pic:cNvPicPr/>
+                  </pic:nvPicPr>
+                  <pic:blipFill>
+                    <a:blip r:embed="rId5">
+                      <a:extLst>
+                        <a:ext uri="{28A0092B-C50C-407E-A947-70E740481C1C}">
+                          <a14:useLocalDpi xmlns:a14="http://schemas.microsoft.com/office/drawing/2010/main" val="0"/>
+                        </a:ext>
+                      </a:extLst>
+                    </a:blip>
+                    <a:stretch>
+                      <a:fillRect/>
+                    </a:stretch>
+                  </pic:blipFill>
+                  <pic:spPr>
+                    <a:xfrm>
+                      <a:off x="0" y="0"/>
+                      <a:ext cx="6038850" cy="3508375"/>
+                    </a:xfrm>
+                    <a:prstGeom prst="rect">
+                      <a:avLst/>
+                    </a:prstGeom>
+                    <a:ln w="38100" cap="sq">
+                      <a:solidFill>
+                        <a:srgbClr val="000000"/>
+                      </a:solidFill>
+                      <a:prstDash val="solid"/>
+                      <a:miter lim="800000"/>
+                    </a:ln>
+                    <a:effectLst>
+                      <a:outerShdw blurRad="50800" dist="38100" dir="2700000" algn="tl" rotWithShape="0">
+                        <a:srgbClr val="000000">
+                          <a:alpha val="43000"/>
+                        </a:srgbClr>
+                      </a:outerShdw>
+                    </a:effectLst>
+                  </pic:spPr>
+                </pic:pic>
+              </a:graphicData>
+            </a:graphic>
+          </wp:inline>
+        </w:drawing>
+      </w:r>
+    </w:p>
+    <w:p>
+      <w:pPr>
         <w:pStyle w:val="Heading1"/>
         <w:spacing w:before="320" w:after="160"/>
       </w:pPr>
@@ -85,6 +176,7 @@
           <w:bCs/>
           <w:color w:val="1F4E79"/>
         </w:rPr>
+        <w:lastRenderedPageBreak/>
         <w:t>2. K-Means Clustering</w:t>
       </w:r>
     </w:p>
@@ -113,6 +205,72 @@
     </w:p>
     <w:p>
       <w:pPr>
+        <w:spacing w:after="160" w:line="300" w:lineRule="auto"/>
+        <w:jc w:val="center"/>
+      </w:pPr>
+      <w:r>
+        <w:rPr>
+          <w:noProof/>
+        </w:rPr>
+        <w:drawing>
+          <wp:inline distT="0" distB="0" distL="0" distR="0" wp14:anchorId="1A3E06E1" wp14:editId="37C828CE">
+            <wp:extent cx="6067425" cy="2571750"/>
+            <wp:effectExtent l="76200" t="76200" r="142875" b="133350"/>
+            <wp:docPr id="110382489" name="Picture 2"/>
+            <wp:cNvGraphicFramePr>
+              <a:graphicFrameLocks xmlns:a="http://schemas.openxmlformats.org/drawingml/2006/main" noChangeAspect="1"/>
+            </wp:cNvGraphicFramePr>
+            <a:graphic xmlns:a="http://schemas.openxmlformats.org/drawingml/2006/main">
+              <a:graphicData uri="http://schemas.openxmlformats.org/drawingml/2006/picture">
+                <pic:pic xmlns:pic="http://schemas.openxmlformats.org/drawingml/2006/picture">
+                  <pic:nvPicPr>
+                    <pic:cNvPr id="110382489" name="Picture 110382489"/>
+                    <pic:cNvPicPr/>
+                  </pic:nvPicPr>
+                  <pic:blipFill>
+                    <a:blip r:embed="rId6">
+                      <a:extLst>
+                        <a:ext uri="{28A0092B-C50C-407E-A947-70E740481C1C}">
+                          <a14:useLocalDpi xmlns:a14="http://schemas.microsoft.com/office/drawing/2010/main" val="0"/>
+                        </a:ext>
+                      </a:extLst>
+                    </a:blip>
+                    <a:stretch>
+                      <a:fillRect/>
+                    </a:stretch>
+                  </pic:blipFill>
+                  <pic:spPr>
+                    <a:xfrm>
+                      <a:off x="0" y="0"/>
+                      <a:ext cx="6067425" cy="2571750"/>
+                    </a:xfrm>
+                    <a:prstGeom prst="rect">
+                      <a:avLst/>
+                    </a:prstGeom>
+                    <a:ln w="38100" cap="sq">
+                      <a:solidFill>
+                        <a:srgbClr val="000000"/>
+                      </a:solidFill>
+                      <a:prstDash val="solid"/>
+                      <a:miter lim="800000"/>
+                    </a:ln>
+                    <a:effectLst>
+                      <a:outerShdw blurRad="50800" dist="38100" dir="2700000" algn="tl" rotWithShape="0">
+                        <a:srgbClr val="000000">
+                          <a:alpha val="43000"/>
+                        </a:srgbClr>
+                      </a:outerShdw>
+                    </a:effectLst>
+                  </pic:spPr>
+                </pic:pic>
+              </a:graphicData>
+            </a:graphic>
+          </wp:inline>
+        </w:drawing>
+      </w:r>
+    </w:p>
+    <w:p>
+      <w:pPr>
         <w:pStyle w:val="Heading2"/>
         <w:spacing w:before="240" w:after="120"/>
       </w:pPr>
@@ -271,7 +429,6 @@
         <w:jc w:val="both"/>
       </w:pPr>
       <w:r>
-        <w:lastRenderedPageBreak/>
         <w:t>Computationally efficient and scales well to large datasets.</w:t>
       </w:r>
     </w:p>
@@ -300,6 +457,7 @@
           <w:bCs/>
           <w:color w:val="2E75B6"/>
         </w:rPr>
+        <w:lastRenderedPageBreak/>
         <w:t>2.5 Disadvantages</w:t>
       </w:r>
     </w:p>
@@ -464,6 +622,72 @@
     </w:p>
     <w:p>
       <w:pPr>
+        <w:spacing w:after="160" w:line="300" w:lineRule="auto"/>
+        <w:jc w:val="center"/>
+      </w:pPr>
+      <w:r>
+        <w:rPr>
+          <w:noProof/>
+        </w:rPr>
+        <w:drawing>
+          <wp:inline distT="0" distB="0" distL="0" distR="0" wp14:anchorId="7F1E550E" wp14:editId="6946BB6E">
+            <wp:extent cx="5915025" cy="3086100"/>
+            <wp:effectExtent l="76200" t="76200" r="142875" b="133350"/>
+            <wp:docPr id="1907887057" name="Picture 3"/>
+            <wp:cNvGraphicFramePr>
+              <a:graphicFrameLocks xmlns:a="http://schemas.openxmlformats.org/drawingml/2006/main" noChangeAspect="1"/>
+            </wp:cNvGraphicFramePr>
+            <a:graphic xmlns:a="http://schemas.openxmlformats.org/drawingml/2006/main">
+              <a:graphicData uri="http://schemas.openxmlformats.org/drawingml/2006/picture">
+                <pic:pic xmlns:pic="http://schemas.openxmlformats.org/drawingml/2006/picture">
+                  <pic:nvPicPr>
+                    <pic:cNvPr id="1907887057" name="Picture 1907887057"/>
+                    <pic:cNvPicPr/>
+                  </pic:nvPicPr>
+                  <pic:blipFill>
+                    <a:blip r:embed="rId7">
+                      <a:extLst>
+                        <a:ext uri="{28A0092B-C50C-407E-A947-70E740481C1C}">
+                          <a14:useLocalDpi xmlns:a14="http://schemas.microsoft.com/office/drawing/2010/main" val="0"/>
+                        </a:ext>
+                      </a:extLst>
+                    </a:blip>
+                    <a:stretch>
+                      <a:fillRect/>
+                    </a:stretch>
+                  </pic:blipFill>
+                  <pic:spPr>
+                    <a:xfrm>
+                      <a:off x="0" y="0"/>
+                      <a:ext cx="5915025" cy="3086100"/>
+                    </a:xfrm>
+                    <a:prstGeom prst="rect">
+                      <a:avLst/>
+                    </a:prstGeom>
+                    <a:ln w="38100" cap="sq">
+                      <a:solidFill>
+                        <a:srgbClr val="000000"/>
+                      </a:solidFill>
+                      <a:prstDash val="solid"/>
+                      <a:miter lim="800000"/>
+                    </a:ln>
+                    <a:effectLst>
+                      <a:outerShdw blurRad="50800" dist="38100" dir="2700000" algn="tl" rotWithShape="0">
+                        <a:srgbClr val="000000">
+                          <a:alpha val="43000"/>
+                        </a:srgbClr>
+                      </a:outerShdw>
+                    </a:effectLst>
+                  </pic:spPr>
+                </pic:pic>
+              </a:graphicData>
+            </a:graphic>
+          </wp:inline>
+        </w:drawing>
+      </w:r>
+    </w:p>
+    <w:p>
+      <w:pPr>
         <w:pStyle w:val="Heading2"/>
         <w:spacing w:before="240" w:after="120"/>
       </w:pPr>
@@ -512,6 +736,7 @@
           <w:b/>
           <w:bCs/>
         </w:rPr>
+        <w:lastRenderedPageBreak/>
         <w:t xml:space="preserve">Divisive (Top-Down): </w:t>
       </w:r>
       <w:r>
@@ -645,11 +870,7 @@
         <w:jc w:val="both"/>
       </w:pPr>
       <w:r>
-        <w:t xml:space="preserve">A dendrogram visually represents the merging process. The height at which two clusters are joined reflects the distance between them the greater the height, the less similar the clusters. Cutting the dendrogram </w:t>
-      </w:r>
-      <w:r>
-        <w:lastRenderedPageBreak/>
-        <w:t>horizontally at a chosen height produces a specific number of clusters, giving flexibility to decide the number of clusters after the algorithm has run.</w:t>
+        <w:t>A dendrogram visually represents the merging process. The height at which two clusters are joined reflects the distance between them the greater the height, the less similar the clusters. Cutting the dendrogram horizontally at a chosen height produces a specific number of clusters, giving flexibility to decide the number of clusters after the algorithm has run.</w:t>
       </w:r>
     </w:p>
     <w:p>
@@ -1045,6 +1266,7 @@
           </w:tcPr>
           <w:p>
             <w:r>
+              <w:lastRenderedPageBreak/>
               <w:t>Number of clusters (k)</w:t>
             </w:r>
           </w:p>
@@ -1356,6 +1578,10 @@
     <w:p>
       <w:pPr>
         <w:spacing w:after="160" w:line="300" w:lineRule="auto"/>
+        <w:rPr>
+          <w:sz w:val="8"/>
+          <w:szCs w:val="8"/>
+        </w:rPr>
       </w:pPr>
     </w:p>
     <w:p>
@@ -1369,7 +1595,6 @@
           <w:bCs/>
           <w:color w:val="1F4E79"/>
         </w:rPr>
-        <w:lastRenderedPageBreak/>
         <w:t>5. Principal Component Analysis (PCA)</w:t>
       </w:r>
     </w:p>
@@ -1380,6 +1605,72 @@
       </w:pPr>
       <w:r>
         <w:t>Principal Component Analysis (PCA) is an unsupervised dimensionality-reduction technique that transforms a dataset with many correlated variables into a smaller set of uncorrelated variables called principal components, while preserving as much of the original variance as possible. It is widely used both to visualize high-dimensional data in two or three dimensions and to reduce the number of features before applying other machine learning algorithms.</w:t>
+      </w:r>
+    </w:p>
+    <w:p>
+      <w:pPr>
+        <w:spacing w:after="160" w:line="300" w:lineRule="auto"/>
+        <w:jc w:val="both"/>
+      </w:pPr>
+      <w:r>
+        <w:rPr>
+          <w:noProof/>
+        </w:rPr>
+        <w:drawing>
+          <wp:inline distT="0" distB="0" distL="0" distR="0" wp14:anchorId="2245FBD3" wp14:editId="471EB601">
+            <wp:extent cx="6086475" cy="3400425"/>
+            <wp:effectExtent l="76200" t="76200" r="142875" b="142875"/>
+            <wp:docPr id="770907291" name="Picture 4"/>
+            <wp:cNvGraphicFramePr>
+              <a:graphicFrameLocks xmlns:a="http://schemas.openxmlformats.org/drawingml/2006/main" noChangeAspect="1"/>
+            </wp:cNvGraphicFramePr>
+            <a:graphic xmlns:a="http://schemas.openxmlformats.org/drawingml/2006/main">
+              <a:graphicData uri="http://schemas.openxmlformats.org/drawingml/2006/picture">
+                <pic:pic xmlns:pic="http://schemas.openxmlformats.org/drawingml/2006/picture">
+                  <pic:nvPicPr>
+                    <pic:cNvPr id="770907291" name="Picture 770907291"/>
+                    <pic:cNvPicPr/>
+                  </pic:nvPicPr>
+                  <pic:blipFill>
+                    <a:blip r:embed="rId8" cstate="print">
+                      <a:extLst>
+                        <a:ext uri="{28A0092B-C50C-407E-A947-70E740481C1C}">
+                          <a14:useLocalDpi xmlns:a14="http://schemas.microsoft.com/office/drawing/2010/main" val="0"/>
+                        </a:ext>
+                      </a:extLst>
+                    </a:blip>
+                    <a:stretch>
+                      <a:fillRect/>
+                    </a:stretch>
+                  </pic:blipFill>
+                  <pic:spPr>
+                    <a:xfrm>
+                      <a:off x="0" y="0"/>
+                      <a:ext cx="6086475" cy="3400425"/>
+                    </a:xfrm>
+                    <a:prstGeom prst="rect">
+                      <a:avLst/>
+                    </a:prstGeom>
+                    <a:ln w="38100" cap="sq">
+                      <a:solidFill>
+                        <a:srgbClr val="000000"/>
+                      </a:solidFill>
+                      <a:prstDash val="solid"/>
+                      <a:miter lim="800000"/>
+                    </a:ln>
+                    <a:effectLst>
+                      <a:outerShdw blurRad="50800" dist="38100" dir="2700000" algn="tl" rotWithShape="0">
+                        <a:srgbClr val="000000">
+                          <a:alpha val="43000"/>
+                        </a:srgbClr>
+                      </a:outerShdw>
+                    </a:effectLst>
+                  </pic:spPr>
+                </pic:pic>
+              </a:graphicData>
+            </a:graphic>
+          </wp:inline>
+        </w:drawing>
       </w:r>
     </w:p>
     <w:p>
@@ -1393,6 +1684,7 @@
           <w:bCs/>
           <w:color w:val="2E75B6"/>
         </w:rPr>
+        <w:lastRenderedPageBreak/>
         <w:t>5.1 Definition</w:t>
       </w:r>
     </w:p>
@@ -1642,7 +1934,6 @@
         <w:jc w:val="both"/>
       </w:pPr>
       <w:r>
-        <w:lastRenderedPageBreak/>
         <w:t>Principal components are linear combinations of original features, which makes them harder to interpret.</w:t>
       </w:r>
     </w:p>
@@ -1714,6 +2005,7 @@
         <w:jc w:val="both"/>
       </w:pPr>
       <w:r>
+        <w:lastRenderedPageBreak/>
         <w:t>Visualizing high-dimensional datasets, such as gene expression or image data, in two or three dimensions.</w:t>
       </w:r>
     </w:p>
@@ -1757,6 +2049,588 @@
       </w:pPr>
       <w:r>
         <w:t>Exploratory data analysis to identify patterns, outliers, and relationships among variables.</w:t>
+      </w:r>
+    </w:p>
+    <w:p>
+      <w:pPr>
+        <w:pStyle w:val="Heading1"/>
+        <w:spacing w:before="320" w:after="160"/>
+      </w:pPr>
+      <w:r>
+        <w:rPr>
+          <w:b/>
+          <w:bCs/>
+          <w:color w:val="1F4E79"/>
+        </w:rPr>
+        <w:t xml:space="preserve">6. Hyperparameter Tuning: </w:t>
+      </w:r>
+      <w:proofErr w:type="spellStart"/>
+      <w:r>
+        <w:rPr>
+          <w:b/>
+          <w:bCs/>
+          <w:color w:val="1F4E79"/>
+        </w:rPr>
+        <w:t>GridSearchCV</w:t>
+      </w:r>
+      <w:proofErr w:type="spellEnd"/>
+      <w:r>
+        <w:rPr>
+          <w:b/>
+          <w:bCs/>
+          <w:color w:val="1F4E79"/>
+        </w:rPr>
+        <w:t xml:space="preserve"> and </w:t>
+      </w:r>
+      <w:proofErr w:type="spellStart"/>
+      <w:r>
+        <w:rPr>
+          <w:b/>
+          <w:bCs/>
+          <w:color w:val="1F4E79"/>
+        </w:rPr>
+        <w:t>RandomizedSearchCV</w:t>
+      </w:r>
+      <w:proofErr w:type="spellEnd"/>
+    </w:p>
+    <w:p>
+      <w:pPr>
+        <w:spacing w:after="160" w:line="300" w:lineRule="auto"/>
+        <w:jc w:val="both"/>
+      </w:pPr>
+      <w:r>
+        <w:t xml:space="preserve">Machine learning models often have hyperparameters, settings that are not learned from data but must be chosen before training (e.g., the number of clusters k, the number of principal components, or a model's regularization strength). Hyperparameter tuning is the process of systematically searching for the combination of values that gives the best model performance. </w:t>
+      </w:r>
+      <w:proofErr w:type="spellStart"/>
+      <w:r>
+        <w:t>GridSearchCV</w:t>
+      </w:r>
+      <w:proofErr w:type="spellEnd"/>
+      <w:r>
+        <w:t xml:space="preserve"> and </w:t>
+      </w:r>
+      <w:proofErr w:type="spellStart"/>
+      <w:r>
+        <w:t>RandomizedSearchCV</w:t>
+      </w:r>
+      <w:proofErr w:type="spellEnd"/>
+      <w:r>
+        <w:t>, both provided by scikit-learn, are two of the most widely used approaches for this search.</w:t>
+      </w:r>
+    </w:p>
+    <w:p>
+      <w:pPr>
+        <w:pStyle w:val="Heading2"/>
+        <w:spacing w:before="240" w:after="120"/>
+        <w:jc w:val="both"/>
+      </w:pPr>
+      <w:r>
+        <w:rPr>
+          <w:b/>
+          <w:bCs/>
+          <w:color w:val="2E75B6"/>
+        </w:rPr>
+        <w:t xml:space="preserve">6.1 </w:t>
+      </w:r>
+      <w:proofErr w:type="spellStart"/>
+      <w:r>
+        <w:rPr>
+          <w:b/>
+          <w:bCs/>
+          <w:color w:val="2E75B6"/>
+        </w:rPr>
+        <w:t>GridSearchCV</w:t>
+      </w:r>
+      <w:proofErr w:type="spellEnd"/>
+    </w:p>
+    <w:p>
+      <w:pPr>
+        <w:spacing w:after="160" w:line="300" w:lineRule="auto"/>
+        <w:jc w:val="both"/>
+      </w:pPr>
+      <w:proofErr w:type="spellStart"/>
+      <w:r>
+        <w:t>GridSearchCV</w:t>
+      </w:r>
+      <w:proofErr w:type="spellEnd"/>
+      <w:r>
+        <w:t xml:space="preserve"> performs an exhaustive search over a manually specified grid of hyperparameter values. For every possible combination of the given values, it trains and evaluates the model using cross-validation, then selects the combination that yields the best average performance. Because it checks every point on the grid, it is guaranteed to find the best combination within that grid, but the number of combinations grows exponentially as more hyperparameters or values are added, making it computationally expensive for large search spaces.</w:t>
+      </w:r>
+    </w:p>
+    <w:p>
+      <w:pPr>
+        <w:pStyle w:val="Heading2"/>
+        <w:spacing w:before="240" w:after="120"/>
+        <w:jc w:val="both"/>
+      </w:pPr>
+      <w:r>
+        <w:rPr>
+          <w:b/>
+          <w:bCs/>
+          <w:color w:val="2E75B6"/>
+        </w:rPr>
+        <w:t xml:space="preserve">6.2 </w:t>
+      </w:r>
+      <w:proofErr w:type="spellStart"/>
+      <w:r>
+        <w:rPr>
+          <w:b/>
+          <w:bCs/>
+          <w:color w:val="2E75B6"/>
+        </w:rPr>
+        <w:t>RandomizedSearchCV</w:t>
+      </w:r>
+      <w:proofErr w:type="spellEnd"/>
+    </w:p>
+    <w:p>
+      <w:pPr>
+        <w:spacing w:after="160" w:line="300" w:lineRule="auto"/>
+        <w:jc w:val="both"/>
+      </w:pPr>
+      <w:proofErr w:type="spellStart"/>
+      <w:r>
+        <w:t>RandomizedSearchCV</w:t>
+      </w:r>
+      <w:proofErr w:type="spellEnd"/>
+      <w:r>
+        <w:t xml:space="preserve"> instead samples a fixed number of random combinations from a specified distribution of hyperparameter values. Rather than testing every possibility, it evaluates only as many combinations as the user specifies (</w:t>
+      </w:r>
+      <w:proofErr w:type="spellStart"/>
+      <w:r>
+        <w:t>n_iter</w:t>
+      </w:r>
+      <w:proofErr w:type="spellEnd"/>
+      <w:r>
+        <w:t xml:space="preserve">), each drawn at random. This makes it far more efficient than </w:t>
+      </w:r>
+      <w:proofErr w:type="spellStart"/>
+      <w:r>
+        <w:t>GridSearchCV</w:t>
+      </w:r>
+      <w:proofErr w:type="spellEnd"/>
+      <w:r>
+        <w:t xml:space="preserve"> when the search space is large, and in practice it often finds a combination close to optimal with a fraction of the computation, though, unlike </w:t>
+      </w:r>
+      <w:proofErr w:type="spellStart"/>
+      <w:r>
+        <w:t>GridSearchCV</w:t>
+      </w:r>
+      <w:proofErr w:type="spellEnd"/>
+      <w:r>
+        <w:t>, it does not guarantee that the single best combination will be tested.</w:t>
+      </w:r>
+    </w:p>
+    <w:p>
+      <w:pPr>
+        <w:pStyle w:val="Heading2"/>
+        <w:spacing w:before="240" w:after="120"/>
+        <w:jc w:val="both"/>
+      </w:pPr>
+      <w:r>
+        <w:rPr>
+          <w:b/>
+          <w:bCs/>
+          <w:color w:val="2E75B6"/>
+        </w:rPr>
+        <w:t>6.3 Graphical Comparison</w:t>
+      </w:r>
+    </w:p>
+    <w:p>
+      <w:pPr>
+        <w:spacing w:after="160" w:line="300" w:lineRule="auto"/>
+        <w:jc w:val="both"/>
+      </w:pPr>
+      <w:r>
+        <w:t xml:space="preserve">The figure below illustrates the difference between the two strategies for the same search budget. </w:t>
+      </w:r>
+      <w:proofErr w:type="spellStart"/>
+      <w:r>
+        <w:t>GridSearchCV</w:t>
+      </w:r>
+      <w:proofErr w:type="spellEnd"/>
+      <w:r>
+        <w:t xml:space="preserve"> evaluates every point on a fixed, evenly spaced grid, while </w:t>
+      </w:r>
+      <w:proofErr w:type="spellStart"/>
+      <w:r>
+        <w:t>RandomizedSearchCV</w:t>
+      </w:r>
+      <w:proofErr w:type="spellEnd"/>
+      <w:r>
+        <w:t xml:space="preserve"> evaluates the same number of points sampled at random from the search space, which allows it to explore a wider range of values for each individual hyperparameter.</w:t>
+      </w:r>
+    </w:p>
+    <w:p>
+      <w:pPr>
+        <w:spacing w:after="160" w:line="300" w:lineRule="auto"/>
+        <w:jc w:val="center"/>
+      </w:pPr>
+      <w:r>
+        <w:rPr>
+          <w:noProof/>
+        </w:rPr>
+        <w:lastRenderedPageBreak/>
+        <w:drawing>
+          <wp:inline distT="0" distB="0" distL="0" distR="0" wp14:anchorId="3E70ADF0" wp14:editId="279CD832">
+            <wp:extent cx="5943600" cy="2963698"/>
+            <wp:effectExtent l="76200" t="76200" r="133350" b="141605"/>
+            <wp:docPr id="1" name="Picture 1" descr="Comparison of GridSearchCV evenly spaced grid sampling and RandomizedSearchCV random sampling across a hyperparameter space"/>
+            <wp:cNvGraphicFramePr>
+              <a:graphicFrameLocks xmlns:a="http://schemas.openxmlformats.org/drawingml/2006/main" noChangeAspect="1"/>
+            </wp:cNvGraphicFramePr>
+            <a:graphic xmlns:a="http://schemas.openxmlformats.org/drawingml/2006/main">
+              <a:graphicData uri="http://schemas.openxmlformats.org/drawingml/2006/picture">
+                <pic:pic xmlns:pic="http://schemas.openxmlformats.org/drawingml/2006/picture">
+                  <pic:nvPicPr>
+                    <pic:cNvPr id="1" name="Picture 1"/>
+                    <pic:cNvPicPr/>
+                  </pic:nvPicPr>
+                  <pic:blipFill>
+                    <a:blip r:embed="rId9"/>
+                    <a:stretch>
+                      <a:fillRect/>
+                    </a:stretch>
+                  </pic:blipFill>
+                  <pic:spPr>
+                    <a:xfrm>
+                      <a:off x="0" y="0"/>
+                      <a:ext cx="5943600" cy="2963698"/>
+                    </a:xfrm>
+                    <a:prstGeom prst="rect">
+                      <a:avLst/>
+                    </a:prstGeom>
+                    <a:ln w="38100" cap="sq">
+                      <a:solidFill>
+                        <a:srgbClr val="000000"/>
+                      </a:solidFill>
+                      <a:prstDash val="solid"/>
+                      <a:miter lim="800000"/>
+                    </a:ln>
+                    <a:effectLst>
+                      <a:outerShdw blurRad="50800" dist="38100" dir="2700000" algn="tl" rotWithShape="0">
+                        <a:srgbClr val="000000">
+                          <a:alpha val="43000"/>
+                        </a:srgbClr>
+                      </a:outerShdw>
+                    </a:effectLst>
+                  </pic:spPr>
+                </pic:pic>
+              </a:graphicData>
+            </a:graphic>
+          </wp:inline>
+        </w:drawing>
+      </w:r>
+    </w:p>
+    <w:p>
+      <w:pPr>
+        <w:spacing w:after="160" w:line="300" w:lineRule="auto"/>
+        <w:jc w:val="center"/>
+      </w:pPr>
+      <w:r>
+        <w:rPr>
+          <w:i/>
+          <w:iCs/>
+          <w:sz w:val="20"/>
+          <w:szCs w:val="20"/>
+        </w:rPr>
+        <w:t xml:space="preserve">Figure: </w:t>
+      </w:r>
+      <w:proofErr w:type="spellStart"/>
+      <w:r>
+        <w:rPr>
+          <w:i/>
+          <w:iCs/>
+          <w:sz w:val="20"/>
+          <w:szCs w:val="20"/>
+        </w:rPr>
+        <w:t>GridSearchCV's</w:t>
+      </w:r>
+      <w:proofErr w:type="spellEnd"/>
+      <w:r>
+        <w:rPr>
+          <w:i/>
+          <w:iCs/>
+          <w:sz w:val="20"/>
+          <w:szCs w:val="20"/>
+        </w:rPr>
+        <w:t xml:space="preserve"> fixed grid vs. </w:t>
+      </w:r>
+      <w:proofErr w:type="spellStart"/>
+      <w:r>
+        <w:rPr>
+          <w:i/>
+          <w:iCs/>
+          <w:sz w:val="20"/>
+          <w:szCs w:val="20"/>
+        </w:rPr>
+        <w:t>RandomizedSearchCV's</w:t>
+      </w:r>
+      <w:proofErr w:type="spellEnd"/>
+      <w:r>
+        <w:rPr>
+          <w:i/>
+          <w:iCs/>
+          <w:sz w:val="20"/>
+          <w:szCs w:val="20"/>
+        </w:rPr>
+        <w:t xml:space="preserve"> random sampling, for the same number of evaluated combinations.</w:t>
+      </w:r>
+    </w:p>
+    <w:p>
+      <w:pPr>
+        <w:pStyle w:val="Heading2"/>
+        <w:spacing w:before="240" w:after="120"/>
+        <w:jc w:val="both"/>
+      </w:pPr>
+      <w:r>
+        <w:rPr>
+          <w:b/>
+          <w:bCs/>
+          <w:color w:val="2E75B6"/>
+        </w:rPr>
+        <w:t>6.4 Advantages</w:t>
+      </w:r>
+    </w:p>
+    <w:p>
+      <w:pPr>
+        <w:pStyle w:val="ListParagraph"/>
+        <w:numPr>
+          <w:ilvl w:val="0"/>
+          <w:numId w:val="2"/>
+        </w:numPr>
+        <w:spacing w:after="80"/>
+        <w:jc w:val="both"/>
+      </w:pPr>
+      <w:proofErr w:type="spellStart"/>
+      <w:r>
+        <w:rPr>
+          <w:b/>
+          <w:bCs/>
+        </w:rPr>
+        <w:t>GridSearchCV</w:t>
+      </w:r>
+      <w:proofErr w:type="spellEnd"/>
+      <w:r>
+        <w:rPr>
+          <w:b/>
+          <w:bCs/>
+        </w:rPr>
+        <w:t xml:space="preserve">: </w:t>
+      </w:r>
+      <w:r>
+        <w:t>Exhaustive and reproducible; guarantees the best combination within the specified grid is found.</w:t>
+      </w:r>
+    </w:p>
+    <w:p>
+      <w:pPr>
+        <w:pStyle w:val="ListParagraph"/>
+        <w:numPr>
+          <w:ilvl w:val="0"/>
+          <w:numId w:val="2"/>
+        </w:numPr>
+        <w:spacing w:after="80"/>
+        <w:jc w:val="both"/>
+      </w:pPr>
+      <w:proofErr w:type="spellStart"/>
+      <w:r>
+        <w:rPr>
+          <w:b/>
+          <w:bCs/>
+        </w:rPr>
+        <w:t>RandomizedSearchCV</w:t>
+      </w:r>
+      <w:proofErr w:type="spellEnd"/>
+      <w:r>
+        <w:rPr>
+          <w:b/>
+          <w:bCs/>
+        </w:rPr>
+        <w:t xml:space="preserve">: </w:t>
+      </w:r>
+      <w:r>
+        <w:t xml:space="preserve">Much faster for large search spaces and lets the user control the search cost directly via </w:t>
+      </w:r>
+      <w:proofErr w:type="spellStart"/>
+      <w:r>
+        <w:t>n_iter</w:t>
+      </w:r>
+      <w:proofErr w:type="spellEnd"/>
+      <w:r>
+        <w:t>.</w:t>
+      </w:r>
+    </w:p>
+    <w:p>
+      <w:pPr>
+        <w:pStyle w:val="ListParagraph"/>
+        <w:numPr>
+          <w:ilvl w:val="0"/>
+          <w:numId w:val="2"/>
+        </w:numPr>
+        <w:spacing w:after="80"/>
+        <w:jc w:val="both"/>
+      </w:pPr>
+      <w:r>
+        <w:t>Both integrate cross-validation automatically, giving a more reliable performance estimate than a single train/test split.</w:t>
+      </w:r>
+    </w:p>
+    <w:p>
+      <w:pPr>
+        <w:pStyle w:val="Heading2"/>
+        <w:spacing w:before="240" w:after="120"/>
+        <w:jc w:val="both"/>
+      </w:pPr>
+      <w:r>
+        <w:rPr>
+          <w:b/>
+          <w:bCs/>
+          <w:color w:val="2E75B6"/>
+        </w:rPr>
+        <w:t>6.5 Disadvantages</w:t>
+      </w:r>
+    </w:p>
+    <w:p>
+      <w:pPr>
+        <w:pStyle w:val="ListParagraph"/>
+        <w:numPr>
+          <w:ilvl w:val="0"/>
+          <w:numId w:val="2"/>
+        </w:numPr>
+        <w:spacing w:after="80"/>
+        <w:jc w:val="both"/>
+      </w:pPr>
+      <w:proofErr w:type="spellStart"/>
+      <w:r>
+        <w:rPr>
+          <w:b/>
+          <w:bCs/>
+        </w:rPr>
+        <w:t>GridSearchCV</w:t>
+      </w:r>
+      <w:proofErr w:type="spellEnd"/>
+      <w:r>
+        <w:rPr>
+          <w:b/>
+          <w:bCs/>
+        </w:rPr>
+        <w:t xml:space="preserve">: </w:t>
+      </w:r>
+      <w:r>
+        <w:t>Becomes computationally infeasible as the number of hyperparameters or candidate values increases (the "curse of dimensionality" of the search space).</w:t>
+      </w:r>
+    </w:p>
+    <w:p>
+      <w:pPr>
+        <w:pStyle w:val="ListParagraph"/>
+        <w:numPr>
+          <w:ilvl w:val="0"/>
+          <w:numId w:val="2"/>
+        </w:numPr>
+        <w:spacing w:after="80"/>
+        <w:jc w:val="both"/>
+      </w:pPr>
+      <w:proofErr w:type="spellStart"/>
+      <w:r>
+        <w:rPr>
+          <w:b/>
+          <w:bCs/>
+        </w:rPr>
+        <w:t>RandomizedSearchCV</w:t>
+      </w:r>
+      <w:proofErr w:type="spellEnd"/>
+      <w:r>
+        <w:rPr>
+          <w:b/>
+          <w:bCs/>
+        </w:rPr>
+        <w:t xml:space="preserve">: </w:t>
+      </w:r>
+      <w:r>
+        <w:t>Does not guarantee finding the single best combination, since large regions of the search space may go untested.</w:t>
+      </w:r>
+    </w:p>
+    <w:p>
+      <w:pPr>
+        <w:pStyle w:val="ListParagraph"/>
+        <w:numPr>
+          <w:ilvl w:val="0"/>
+          <w:numId w:val="2"/>
+        </w:numPr>
+        <w:spacing w:after="80"/>
+        <w:jc w:val="both"/>
+      </w:pPr>
+      <w:r>
+        <w:t>Both can still be slow when each model evaluation itself is expensive, since cross-validation multiplies the number of times the model must be trained.</w:t>
+      </w:r>
+    </w:p>
+    <w:p>
+      <w:pPr>
+        <w:pStyle w:val="Heading2"/>
+        <w:spacing w:before="240" w:after="120"/>
+        <w:jc w:val="both"/>
+      </w:pPr>
+      <w:r>
+        <w:rPr>
+          <w:b/>
+          <w:bCs/>
+          <w:color w:val="2E75B6"/>
+        </w:rPr>
+        <w:t>6.6 Applications</w:t>
+      </w:r>
+    </w:p>
+    <w:p>
+      <w:pPr>
+        <w:pStyle w:val="ListParagraph"/>
+        <w:numPr>
+          <w:ilvl w:val="0"/>
+          <w:numId w:val="2"/>
+        </w:numPr>
+        <w:spacing w:after="80"/>
+        <w:jc w:val="both"/>
+      </w:pPr>
+      <w:r>
+        <w:t>Tuning the number of clusters or distance thresholds in K-Means and Hierarchical Clustering.</w:t>
+      </w:r>
+    </w:p>
+    <w:p>
+      <w:pPr>
+        <w:pStyle w:val="ListParagraph"/>
+        <w:numPr>
+          <w:ilvl w:val="0"/>
+          <w:numId w:val="2"/>
+        </w:numPr>
+        <w:spacing w:after="80"/>
+        <w:jc w:val="both"/>
+      </w:pPr>
+      <w:r>
+        <w:t>Selecting the number of PCA components alongside downstream model hyperparameters in a single pipeline.</w:t>
+      </w:r>
+    </w:p>
+    <w:p>
+      <w:pPr>
+        <w:pStyle w:val="ListParagraph"/>
+        <w:numPr>
+          <w:ilvl w:val="0"/>
+          <w:numId w:val="2"/>
+        </w:numPr>
+        <w:spacing w:after="80"/>
+        <w:jc w:val="both"/>
+      </w:pPr>
+      <w:r>
+        <w:t>Optimizing regularization strength, tree depth, learning rate, and other parameters of supervised models.</w:t>
+      </w:r>
+    </w:p>
+    <w:p>
+      <w:pPr>
+        <w:pStyle w:val="ListParagraph"/>
+        <w:numPr>
+          <w:ilvl w:val="0"/>
+          <w:numId w:val="2"/>
+        </w:numPr>
+        <w:spacing w:after="80"/>
+        <w:jc w:val="both"/>
+      </w:pPr>
+      <w:r>
+        <w:t>General model-selection workflows where a quick random search is used first to narrow the range, followed by a focused grid search.</w:t>
       </w:r>
     </w:p>
     <w:sectPr>
@@ -2413,7 +3287,6 @@
   <w:style w:type="character" w:default="1" w:styleId="DefaultParagraphFont">
     <w:name w:val="Default Paragraph Font"/>
     <w:uiPriority w:val="1"/>
-    <w:semiHidden/>
     <w:unhideWhenUsed/>
   </w:style>
   <w:style w:type="table" w:default="1" w:styleId="TableNormal">

</xml_diff>